<commit_message>
Auto commit (2026-09-04 16:03) — 6 changes
Claude Code 세션 종료 시 자동 커밋.

Co-Authored-By: Claude <noreply@anthropic.com>
</commit_message>
<xml_diff>
--- a/projects/13_janitor_billionaire/Vigloo AI Drama Proposal_THEY MADE ME KNEEL IN MY OWN STABLES.docx
+++ b/projects/13_janitor_billionaire/Vigloo AI Drama Proposal_THEY MADE ME KNEEL IN MY OWN STABLES.docx
@@ -1679,7 +1679,7 @@
                 <w:rFonts w:ascii="Malgun Gothic" w:hAnsi="Malgun Gothic" w:eastAsia="Malgun Gothic"/>
                 <w:sz w:val="20"/>
               </w:rPr>
-              <w:t>콜 그룹 대표 이선 콜은 결혼 5년 동안 아내 바네사 브룩스의 성공을 전부 몰래 사주고도 한 번도 그 말을 하지 않는다. 5년 만에 귀국하는 장인 월터 브룩스를 마중한 이선은 장인이 건넨 1983년산 로마네 콩티를 들고, 아내에게 줄 스털링 그룹 앰배서더 계약서를 품에 넣은 채 자기가 사서 아내에게 넘겨준 승마 클럽으로 간다. 근육을 다쳐 마장만 한 바퀴 돌겠다며 1회 이용권 두 장을 끊자, 바네사의 전속 승마 코치 타일러 퀸이 앞을 막고 이 클럽은 자기 여자 것이라고 한다. 이선이 자기가 이 클럽 주인이고 콜 그룹 대표라고 말해도 아무도 믿지 않는다. 타일러는 월터의 머리에 청소용 구정물을 붓고 지팡이를 빼앗아 다리를 걷어차고, 이선을 무릎 꿇려 70만 달러짜리 와인을 머리에 부은 뒤 병을 깨고, 유리를 줍는 손을 밟는다. 밟힌 손으로 이선은 어릴 적 친구 노라 스털링에게 전화해 제일 잘하는 이혼 변호사를 붙여 달라고 한다. 장인의 멱살이 잡히자 이선은 안장을 집어 들어 타일러의 등을 내리치고 그 위에 올라타 머리를 바닥에 찍지만, 마부들에게 다시 붙잡혀 마방 안에 갇히고 흥분한 종마 앞에 세워진다. 앞발을 든 말의 고삐를 맨손으로 잡아 끌어내린 이선 앞에서 타일러는 라이브 방송을 켜고 시계가 짝퉁이라며 바닥에 내던져 부수는데, 댓글은 그 시계가 60만 달러이고 바네사의 남편이 콜 그룹 대표라고 말한다.</w:t>
+              <w:t>콜 그룹 대표 이선 콜은 결혼 5년 동안 아내 바네사 브룩스의 성공을 전부 몰래 사주고도 한 번도 그 말을 하지 않는다. 5년 만에 귀국하는 장인 월터 브룩스를 마중한 이선은 장인이 건넨 1983년산 로마네 콩티를 들고, 아내에게 줄 스털링 그룹 앰배서더 계약서를 품에 넣은 채 자기가 사서 아내에게 넘겨준 승마 클럽으로 간다. 근육을 다쳐 마장만 한 바퀴 돌겠다며 1회 이용권 두 장을 끊자, 바네사의 전속 승마 코치 타일러 퀸이 앞을 막고 이 클럽은 자기 여자 것이라고 한다. 타일러는 그를 아내 돈으로 사는 놈이라 몰아붙이고, 이선이 자기가 이 클럽 주인이고 콜 그룹 대표라고 말해도 아무도 믿지 않는다. 타일러는 월터의 머리에 청소용 구정물을 붓고 지팡이를 빼앗아 다리를 걷어차고, 이선을 무릎 꿇려 70만 달러짜리 와인을 머리에 부은 뒤 병을 깨고, 유리를 줍는 손을 밟는다. 밟힌 손으로 이선은 어릴 적 친구 노라 스털링에게 전화해 제일 잘하는 이혼 변호사를 붙여 달라고 한다. 장인의 멱살이 잡히자 이선은 안장을 집어 들어 타일러의 등을 내리치고 그 위에 올라타 머리를 바닥에 찍지만, 마부들에게 다시 붙잡혀 마방 안에 갇히고 흥분한 종마 앞에 세워진다. 앞발을 든 말의 고삐를 맨손으로 잡아 끌어내린 이선 앞에서 타일러는 라이브 방송을 켜고 시계가 짝퉁이라며 바닥에 내던져 부수는데, 댓글은 그 시계가 60만 달러이고 바네사의 남편이 콜 그룹 대표라고 말한다.</w:t>
             </w:r>
           </w:p>
           <w:p>
@@ -1747,7 +1747,7 @@
                 <w:rFonts w:ascii="Malgun Gothic" w:hAnsi="Malgun Gothic" w:eastAsia="Malgun Gothic"/>
                 <w:sz w:val="20"/>
               </w:rPr>
-              <w:t>科尔集团总裁伊森·科尔结婚五年，一直偷偷出钱捧红妻子瓦妮莎·布鲁克斯的事业，却一次都没说出口。今天他去接阔别五年回国的岳父沃尔特·布鲁克斯，手里拿着岳父送的1983年的罗曼尼·康帝，怀里揣着要给妻子的斯特林集团品牌代言合同，两人一起去了他买下送给妻子的那家马术俱乐部。伊森说自己拉伤了肌肉，只想绕马场骑一圈，买了两张单次通行券，瓦妮莎的专属马术教练泰勒·奎因立刻拦住他俩，说这家俱乐部是他女人的。伊森说自己才是这家俱乐部的主人、是科尔集团的总裁，没人信。泰勒把清扫用的脏水浇在沃尔特头上，抢过拐杖，一脚踹在他腿上，又逼伊森跪下，把一瓶70万美元的红酒倒在他头上，摔碎酒瓶，还踩住伊森捡玻璃碎片的手。伊森用那只被踩的手打电话给儿时好友诺拉·斯特林，求她找最厉害的离婚律师。泰勒揪住岳父的衣领时，伊森抄起马鞍砸在泰勒背上，把他压在地上砸他的头，可又被马夫们按住，拖进马厩、推到发狂的种马前面。伊森空手抓住扬起前蹄的马的缰绳把它拽下来，泰勒当着他的面开了直播，说他手上的表是假货，摘下来砸在地上，评论区却说那块表要60万美元，还说瓦妮莎的丈夫就是科尔集团的总裁。</w:t>
+              <w:t>科尔集团总裁伊森·科尔结婚五年，一直偷偷出钱捧红妻子瓦妮莎·布鲁克斯的事业，却一次都没说出口。今天他去接阔别五年回国的岳父沃尔特·布鲁克斯，手里拿着岳父送的1983年的罗曼尼·康帝，怀里揣着要给妻子的斯特林集团品牌代言合同，两人一起去了他买下送给妻子的那家马术俱乐部。伊森说自己拉伤了肌肉，只想绕马场骑一圈，买了两张单次通行券，瓦妮莎的专属马术教练泰勒·奎因立刻拦住他俩，说这家俱乐部是他女人的。泰勒一口咬定他是靠老婆的钱过日子的人，伊森说自己才是这家俱乐部的主人、是科尔集团的总裁，没人信。泰勒把清扫用的脏水浇在沃尔特头上，抢过拐杖，一脚踹在他腿上，又逼伊森跪下，把一瓶70万美元的红酒倒在他头上，摔碎酒瓶，还踩住伊森捡玻璃碎片的手。伊森用那只被踩的手打电话给儿时好友诺拉·斯特林，求她找最厉害的离婚律师。泰勒揪住岳父的衣领时，伊森抄起马鞍砸在泰勒背上，把他压在地上砸他的头，可又被马夫们按住，拖进马厩、推到发狂的种马前面。伊森空手抓住扬起前蹄的马的缰绳把它拽下来，泰勒当着他的面开了直播，说他手上的表是假货，摘下来砸在地上，评论区却说那块表要60万美元，还说瓦妮莎的丈夫就是科尔集团的总裁。</w:t>
             </w:r>
           </w:p>
           <w:p>
@@ -4394,24 +4394,24 @@
                 <w:rFonts w:ascii="Malgun Gothic" w:hAnsi="Malgun Gothic" w:eastAsia="Malgun Gothic"/>
                 <w:sz w:val="20"/>
               </w:rPr>
-              <w:t>결혼 5년 동안 아내의 성공을 전부 몰래 사주고도 한 번도 그 말을 안 한 콜 그룹 대표 이선 콜. 오늘 이선은 5년 만에 귀국하는 장인을 마중하러 활주로에 나가, 아내 바네사 브룩스에게 같이 나가자고 전화를 건다. 바네사는 남편이 사서 넘겨준 프라이빗 승마 클럽 실내 마장에 있다. 전속 승마 코치 타일러 퀸이 안장에 앉은 바네사의 자세를 고쳐 준다며 뒤에서 허리를 감아쥐고 몸을 붙이고, 수업은 곧 밀회로 바뀐다. 타일러가 그 늙은이와 이혼하라고 하자 바네사는 이 클럽을 주겠다며 여기서는 네가 내 남편이라고 답하고, 걸려 온 전화는 바쁘다는 말만 하고 끊는다.</w:t>
-            </w:r>
-          </w:p>
-          <w:p>
-            <w:r>
-              <w:rPr>
-                <w:rFonts w:ascii="Malgun Gothic" w:hAnsi="Malgun Gothic" w:eastAsia="Malgun Gothic"/>
-                <w:sz w:val="20"/>
-              </w:rPr>
-            </w:r>
-          </w:p>
-          <w:p>
-            <w:r>
-              <w:rPr>
-                <w:rFonts w:ascii="Malgun Gothic" w:hAnsi="Malgun Gothic" w:eastAsia="Malgun Gothic"/>
-                <w:sz w:val="20"/>
-              </w:rPr>
-              <w:t>전용기에서 지팡이를 짚고 내려온 장인 월터 브룩스가 1983년산 로마네 콩티를 건네자, 이선은 스털링 그룹의 글로벌 앰배서더 계약서를 꺼내 보여준다. 바네사는 그 계약도, 아버지의 귀국도 모른다. 클럽에 들어선 이선은 허리를 다쳐 빠르게는 못 타니 아버님과 마장을 천천히 한 바퀴만 돌겠다며 1회 이용권 두 장을 끊는다. 비싼 시계를 찬 사람이 제일 싼 표를 끊는 것을 본 타일러가 앞을 막아선다.</w:t>
+              <w:t>결혼 5년 동안 아내의 성공을 전부 몰래 사주고도 한 번도 그 말을 안 한 콜 그룹 대표 이선 콜. 오늘 이선은 5년 만에 귀국하는 장인을 마중하러 활주로에 나가, 아내 바네사 브룩스에게 같이 나가자고 전화를 건다. 바네사는 남편이 사서 넘겨준 프라이빗 승마 클럽 실내 마장에 있다. 전속 승마 코치 타일러 퀸이 안장에 앉은 바네사의 자세를 고쳐 준다며 뒤에서 허리를 감아쥐고, 수업은 곧 밀회로 바뀐다. 타일러가 그 늙은이와 이혼하라고 하자 바네사는 이 클럽을 주겠다며 여기서는 네가 내 남편이라고 답하고, 걸려 온 전화는 바쁘다는 말만 하고 끊는다.</w:t>
+            </w:r>
+          </w:p>
+          <w:p>
+            <w:r>
+              <w:rPr>
+                <w:rFonts w:ascii="Malgun Gothic" w:hAnsi="Malgun Gothic" w:eastAsia="Malgun Gothic"/>
+                <w:sz w:val="20"/>
+              </w:rPr>
+            </w:r>
+          </w:p>
+          <w:p>
+            <w:r>
+              <w:rPr>
+                <w:rFonts w:ascii="Malgun Gothic" w:hAnsi="Malgun Gothic" w:eastAsia="Malgun Gothic"/>
+                <w:sz w:val="20"/>
+              </w:rPr>
+              <w:t>전용기에서 지팡이를 짚고 내려온 장인 월터 브룩스가 1983년산 로마네 콩티를 건네자, 이선은 스털링 그룹의 글로벌 앰배서더 계약서를 꺼내 보여준다. 바네사는 그 계약도, 아버지의 귀국도 모른다. 클럽에 들어선 이선은 허리를 다쳐 아버님과 마장만 천천히 한 바퀴 돌겠다며 1회 이용권 두 장을 끊는다. 비싼 시계를 찬 사람이 제일 싼 표를 끊는 것을 본 타일러가 앞을 막아선다.</w:t>
             </w:r>
           </w:p>
           <w:p>
@@ -4446,24 +4446,24 @@
                 <w:rFonts w:ascii="Malgun Gothic" w:hAnsi="Malgun Gothic" w:eastAsia="Malgun Gothic"/>
                 <w:sz w:val="20"/>
               </w:rPr>
-              <w:t>结婚五年,伊森·科尔一直偷偷出钱捧红妻子的事业,却从没说出口。这天他要去机场接五年没回国的岳父,打电话叫妻子瓦妮莎·布鲁克斯一起去。瓦妮莎正在丈夫买下送给她的私人马术俱乐部室内马场里。专属教练泰勒·奎因说要纠正她的骑姿,从背后搂住她的腰贴上来,训练课很快变成幽会。泰勒让她和那个老头离婚,瓦妮莎说会把这家俱乐部送给他,在这里你才是我丈夫;电话打进来,她只说了句"忙",挂了。</w:t>
-            </w:r>
-          </w:p>
-          <w:p>
-            <w:r>
-              <w:rPr>
-                <w:rFonts w:ascii="Malgun Gothic" w:hAnsi="Malgun Gothic" w:eastAsia="Malgun Gothic"/>
-                <w:sz w:val="20"/>
-              </w:rPr>
-            </w:r>
-          </w:p>
-          <w:p>
-            <w:r>
-              <w:rPr>
-                <w:rFonts w:ascii="Malgun Gothic" w:hAnsi="Malgun Gothic" w:eastAsia="Malgun Gothic"/>
-                <w:sz w:val="20"/>
-              </w:rPr>
-              <w:t>岳父沃尔特·布鲁克斯拄着拐杖从私人飞机上下来,递给他一瓶1983年的罗曼尼·康帝,伊森拿出斯特林集团的全球品牌代言合同给他看。瓦妮莎不知道这份合同,也不知道父亲回国了。伊森走进俱乐部,说自己腰伤没好不能骑快马,只想陪岳父慢慢绕马场走一圈,买了两张单次通行券。泰勒看见戴着名表的人买最便宜的票,上前拦住他们。</w:t>
+              <w:t>结婚五年，伊森·科尔一直偷偷出钱捧红妻子的事业，却从没说出口。这天他要去机场接五年没回国的岳父，打电话叫妻子瓦妮莎·布鲁克斯一起去。瓦妮莎正在丈夫买下送给她的私人马术俱乐部室内马场里。专属教练泰勒·奎因说要纠正她的骑姿，从背后搂住她的腰贴上来，训练课很快变成幽会。泰勒让她和那个老头离婚，瓦妮莎说会把这家俱乐部送给他，在这里你才是我丈夫;电话打进来，她只说了句"忙"，挂了。</w:t>
+            </w:r>
+          </w:p>
+          <w:p>
+            <w:r>
+              <w:rPr>
+                <w:rFonts w:ascii="Malgun Gothic" w:hAnsi="Malgun Gothic" w:eastAsia="Malgun Gothic"/>
+                <w:sz w:val="20"/>
+              </w:rPr>
+            </w:r>
+          </w:p>
+          <w:p>
+            <w:r>
+              <w:rPr>
+                <w:rFonts w:ascii="Malgun Gothic" w:hAnsi="Malgun Gothic" w:eastAsia="Malgun Gothic"/>
+                <w:sz w:val="20"/>
+              </w:rPr>
+              <w:t>岳父沃尔特·布鲁克斯拄着拐杖从私人飞机上下来，递给他一瓶1983年的罗曼尼·康帝，伊森拿出斯特林集团的全球品牌代言合同给他看。瓦妮莎不知道这份合同，也不知道父亲回国了。伊森走进俱乐部，说自己腰伤没好不能骑快马，只想陪岳父慢慢绕马场走一圈，买了两张单次通行券。泰勒看见戴着名表的人买最便宜的票，上前拦住他们。</w:t>
             </w:r>
           </w:p>
           <w:p>
@@ -4498,7 +4498,7 @@
                 <w:rFonts w:ascii="Malgun Gothic" w:hAnsi="Malgun Gothic" w:eastAsia="Malgun Gothic"/>
                 <w:sz w:val="20"/>
               </w:rPr>
-              <w:t>이선은 손에 든 이용권 두 장을 타일러 앞에 내보이며, 마장을 한 바퀴 돌러 온 사람이면 누구나 쓸 수 있는 표 아니냐고 묻는다. 타일러는 태블릿에 뜬 정보를 소리 내어 읽고, 서른인데 벌써 손이 떨리게 생겼다며 말 등에 올라 본 적이나 있겠느냐고 비웃는다. 타일러는 자기가 지금 가로막은 남자가 이 클럽을 사서 바네사에게 준 사람인 줄 모른다. 월터가 말조심하라고 소리치자 타일러는 두 사람을 걸어 다니는 요양원이라고 부르고, 네가 여기서 이러는 동안 네 아내는 밖에서 다른 놈이랑 있을 거라고 한다.</w:t>
+              <w:t>이선은 손에 든 이용권 두 장을 타일러 앞에 내보이며, 마장을 한 바퀴 돌러 온 사람이면 누구나 쓸 수 있는 표 아니냐고 묻는다. 타일러는 태블릿에 뜬 정보를 소리 내어 읽고, 서른에 제 돈 한 푼 없이 아내 돈으로 사는 놈이 말은 타 봤겠느냐고 비웃는다. 타일러는 자기가 지금 가로막은 남자가 이 클럽을 사서 바네사에게 준 사람인 줄 모른다. 월터가 말조심하라고 소리치자 타일러는 두 사람을 걸어 다니는 요양원이라고 부르고, 네가 여기서 이러는 동안 네 아내는 밖에서 다른 놈이랑 있을 거라고 한다.</w:t>
             </w:r>
           </w:p>
           <w:p>
@@ -4550,24 +4550,24 @@
                 <w:rFonts w:ascii="Malgun Gothic" w:hAnsi="Malgun Gothic" w:eastAsia="Malgun Gothic"/>
                 <w:sz w:val="20"/>
               </w:rPr>
-              <w:t>伊森把手里两张通行券举到泰勒面前,问他这不就是给来绕场一圈的人用的票吗。泰勒盯着平板上的信息念出声,笑他都三十岁了手还抖成这样,说他这辈子怕是没上过马背。泰勒不知道自己拦住的这个人正是买下这家俱乐部送给瓦妮莎的人。沃尔特喊他说话小心点,泰勒却叫他们两个"会走路的养老院",说你在这儿闹的时候,你老婆正在外面跟别的男人在一起。</w:t>
-            </w:r>
-          </w:p>
-          <w:p>
-            <w:r>
-              <w:rPr>
-                <w:rFonts w:ascii="Malgun Gothic" w:hAnsi="Malgun Gothic" w:eastAsia="Malgun Gothic"/>
-                <w:sz w:val="20"/>
-              </w:rPr>
-            </w:r>
-          </w:p>
-          <w:p>
-            <w:r>
-              <w:rPr>
-                <w:rFonts w:ascii="Malgun Gothic" w:hAnsi="Malgun Gothic" w:eastAsia="Malgun Gothic"/>
-                <w:sz w:val="20"/>
-              </w:rPr>
-              <w:t>伊森说别跟这种垃圾废话,拉着岳父要走,泰勒喊人把门堵上,马夫们上前拦住去路。泰勒的妹妹、俱乐部社交主管珍娜·奎因抱着胳膊在旁边帮腔,说两个买单次票的老头在这儿搅局。泰勒说这里年费最低五万美元,你们俩加起来就一张最便宜的票。伊森问他一个员工这么对待客人,不怕老板知道了炒了你吗,泰勒放声大笑。</w:t>
+              <w:t>伊森把手里两张通行券举到泰勒面前，问他这不就是给来绕场一圈的人用的票吗。泰勒盯着平板上的信息念出声，笑他三十岁了自己一分钱都没有、靠老婆的钱过日子，这种人也上过马背？泰勒不知道自己拦住的这个人正是买下这家俱乐部送给瓦妮莎的人。沃尔特喊他说话小心点，泰勒却叫他们两个"会走路的养老院"，说你在这儿闹的时候，你老婆正在外面跟别的男人在一起。</w:t>
+            </w:r>
+          </w:p>
+          <w:p>
+            <w:r>
+              <w:rPr>
+                <w:rFonts w:ascii="Malgun Gothic" w:hAnsi="Malgun Gothic" w:eastAsia="Malgun Gothic"/>
+                <w:sz w:val="20"/>
+              </w:rPr>
+            </w:r>
+          </w:p>
+          <w:p>
+            <w:r>
+              <w:rPr>
+                <w:rFonts w:ascii="Malgun Gothic" w:hAnsi="Malgun Gothic" w:eastAsia="Malgun Gothic"/>
+                <w:sz w:val="20"/>
+              </w:rPr>
+              <w:t>伊森说别跟这种垃圾废话，拉着岳父要走，泰勒喊人把门堵上，马夫们上前拦住去路。泰勒的妹妹、俱乐部社交主管珍娜·奎因抱着胳膊在旁边帮腔，说两个买单次票的老头在这儿搅局。泰勒说这里年费最低五万美元，你们俩加起来就一张最便宜的票。伊森问他一个员工这么对待客人，不怕老板知道了炒了你吗，泰勒放声大笑。</w:t>
             </w:r>
           </w:p>
           <w:p>
@@ -4671,41 +4671,41 @@
                 <w:rFonts w:ascii="Malgun Gothic" w:hAnsi="Malgun Gothic" w:eastAsia="Malgun Gothic"/>
                 <w:sz w:val="20"/>
               </w:rPr>
-              <w:t>泰勒看着僵住的伊森笑着说,这家俱乐部是老婆为他买的,两人常在这儿骑得很欢。沃尔特说他们走错地方了,搂着女婿肩膀转身要走,泰勒却拦在前面,说刚才那句话他不爱听,要伊森跪下道歉。伊森说谁敢碰岳父一根手指头,一定让他后悔。</w:t>
-            </w:r>
-          </w:p>
-          <w:p>
-            <w:r>
-              <w:rPr>
-                <w:rFonts w:ascii="Malgun Gothic" w:hAnsi="Malgun Gothic" w:eastAsia="Malgun Gothic"/>
-                <w:sz w:val="20"/>
-              </w:rPr>
-            </w:r>
-          </w:p>
-          <w:p>
-            <w:r>
-              <w:rPr>
-                <w:rFonts w:ascii="Malgun Gothic" w:hAnsi="Malgun Gothic" w:eastAsia="Malgun Gothic"/>
-                <w:sz w:val="20"/>
-              </w:rPr>
-              <w:t>泰勒提起马厩旁的清洁脏水桶,兜头浇在沃尔特头上。脏水顺着沃尔特的西装往下流,马夫们哄笑。泰勒不知道自己刚泼了脏水的这位老人是谁。沃尔特掏出手机说要报警,泰勒一把打掉手机,揪住他的衣领。就在这时伊森一拳挥出去,混战之中泰勒脖子上的项链被扯断,落进了伊森手里。</w:t>
-            </w:r>
-          </w:p>
-          <w:p>
-            <w:r>
-              <w:rPr>
-                <w:rFonts w:ascii="Malgun Gothic" w:hAnsi="Malgun Gothic" w:eastAsia="Malgun Gothic"/>
-                <w:sz w:val="20"/>
-              </w:rPr>
-            </w:r>
-          </w:p>
-          <w:p>
-            <w:r>
-              <w:rPr>
-                <w:rFonts w:ascii="Malgun Gothic" w:hAnsi="Malgun Gothic" w:eastAsia="Malgun Gothic"/>
-                <w:sz w:val="20"/>
-              </w:rPr>
-              <w:t>五年前瓦妮莎说这是夫妻信物,刻了同样的字母,给伊森和自己各戴上一条项链。手里攥着和自己脖子上一模一样的项链,伊森终于明白,妻子那些"跟朋友逛街""工作太忙"的话,根本不是没时间。</w:t>
+              <w:t>泰勒看着僵住的伊森笑着说，这家俱乐部是老婆为他买的，两人常在这儿骑得很欢。沃尔特说他们走错地方了，搂着女婿肩膀转身要走，泰勒却拦在前面，说刚才那句话他不爱听，要伊森跪下道歉。伊森说谁敢碰岳父一根手指头，一定让他后悔。</w:t>
+            </w:r>
+          </w:p>
+          <w:p>
+            <w:r>
+              <w:rPr>
+                <w:rFonts w:ascii="Malgun Gothic" w:hAnsi="Malgun Gothic" w:eastAsia="Malgun Gothic"/>
+                <w:sz w:val="20"/>
+              </w:rPr>
+            </w:r>
+          </w:p>
+          <w:p>
+            <w:r>
+              <w:rPr>
+                <w:rFonts w:ascii="Malgun Gothic" w:hAnsi="Malgun Gothic" w:eastAsia="Malgun Gothic"/>
+                <w:sz w:val="20"/>
+              </w:rPr>
+              <w:t>泰勒提起马厩旁的清洁脏水桶，兜头浇在沃尔特头上。脏水顺着沃尔特的西装往下流，马夫们哄笑。泰勒不知道自己刚泼了脏水的这位老人是谁。沃尔特掏出手机说要报警，泰勒一把打掉手机，揪住他的衣领。就在这时伊森一拳挥出去，混战之中泰勒脖子上的项链被扯断，落进了伊森手里。</w:t>
+            </w:r>
+          </w:p>
+          <w:p>
+            <w:r>
+              <w:rPr>
+                <w:rFonts w:ascii="Malgun Gothic" w:hAnsi="Malgun Gothic" w:eastAsia="Malgun Gothic"/>
+                <w:sz w:val="20"/>
+              </w:rPr>
+            </w:r>
+          </w:p>
+          <w:p>
+            <w:r>
+              <w:rPr>
+                <w:rFonts w:ascii="Malgun Gothic" w:hAnsi="Malgun Gothic" w:eastAsia="Malgun Gothic"/>
+                <w:sz w:val="20"/>
+              </w:rPr>
+              <w:t>五年前瓦妮莎说这是夫妻信物，刻了同样的字母，给伊森和自己各戴上一条项链。手里攥着和自己脖子上一模一样的项链，伊森终于明白，妻子那些"跟朋友逛街""工作太忙"的话，根本不是没时间。</w:t>
             </w:r>
           </w:p>
           <w:p>
@@ -4809,50 +4809,50 @@
                 <w:rFonts w:ascii="Malgun Gothic" w:hAnsi="Malgun Gothic" w:eastAsia="Malgun Gothic"/>
                 <w:sz w:val="20"/>
               </w:rPr>
-              <w:t>珍娜一脚踩碎了掉在地上的沃尔特的手机。伊森把手里的项链扔过去,泰勒接住重新戴回脖子上,指着马厩说那边那匹马是老婆两周年圣诞节送他的,花了40万美元。泰勒说他那单次通行券攒一百年也买不起那一匹马。</w:t>
-            </w:r>
-          </w:p>
-          <w:p>
-            <w:r>
-              <w:rPr>
-                <w:rFonts w:ascii="Malgun Gothic" w:hAnsi="Malgun Gothic" w:eastAsia="Malgun Gothic"/>
-                <w:sz w:val="20"/>
-              </w:rPr>
-            </w:r>
-          </w:p>
-          <w:p>
-            <w:r>
-              <w:rPr>
-                <w:rFonts w:ascii="Malgun Gothic" w:hAnsi="Malgun Gothic" w:eastAsia="Malgun Gothic"/>
-                <w:sz w:val="20"/>
-              </w:rPr>
-              <w:t>那年圣诞节,伊森把要送妻子的礼物放上床,接了个电话,瓦妮莎说朋友被送去急诊室了,让他先睡。伊森又问了一遍是不是真的是圣诞节那天,泰勒说当然是。</w:t>
-            </w:r>
-          </w:p>
-          <w:p>
-            <w:r>
-              <w:rPr>
-                <w:rFonts w:ascii="Malgun Gothic" w:hAnsi="Malgun Gothic" w:eastAsia="Malgun Gothic"/>
-                <w:sz w:val="20"/>
-              </w:rPr>
-            </w:r>
-          </w:p>
-          <w:p>
-            <w:r>
-              <w:rPr>
-                <w:rFonts w:ascii="Malgun Gothic" w:hAnsi="Malgun Gothic" w:eastAsia="Malgun Gothic"/>
-                <w:sz w:val="20"/>
-              </w:rPr>
-              <w:t>泰勒说他又无聊又软弱又一无所有,让他跪下,珍娜也在旁边帮腔,叫他这把老骨头也动一动。沃尔特忍无可忍,抡起拐杖朝泰勒脸上打去。泰勒嘴唇打裂,沃尔特冲他吼,靠女人养活也值得炫耀吗,布鲁克斯传媒养你这种人是耻辱,让他去把瓦妮莎·布鲁克斯叫来。</w:t>
-            </w:r>
-          </w:p>
-          <w:p>
-            <w:r>
-              <w:rPr>
-                <w:rFonts w:ascii="Malgun Gothic" w:hAnsi="Malgun Gothic" w:eastAsia="Malgun Gothic"/>
-                <w:sz w:val="20"/>
-              </w:rPr>
-              <w:t>"你……你说你是瓦妮莎的父亲?"</w:t>
+              <w:t>珍娜一脚踩碎了掉在地上的沃尔特的手机。伊森把手里的项链扔过去，泰勒接住重新戴回脖子上，指着马厩说那边那匹马是老婆两周年圣诞节送他的，花了40万美元。泰勒说他那单次通行券攒一百年也买不起那一匹马。</w:t>
+            </w:r>
+          </w:p>
+          <w:p>
+            <w:r>
+              <w:rPr>
+                <w:rFonts w:ascii="Malgun Gothic" w:hAnsi="Malgun Gothic" w:eastAsia="Malgun Gothic"/>
+                <w:sz w:val="20"/>
+              </w:rPr>
+            </w:r>
+          </w:p>
+          <w:p>
+            <w:r>
+              <w:rPr>
+                <w:rFonts w:ascii="Malgun Gothic" w:hAnsi="Malgun Gothic" w:eastAsia="Malgun Gothic"/>
+                <w:sz w:val="20"/>
+              </w:rPr>
+              <w:t>那年圣诞节，伊森把要送妻子的礼物放上床，接了个电话，瓦妮莎说朋友被送去急诊室了，让他先睡。伊森又问了一遍是不是真的是圣诞节那天，泰勒说当然是。</w:t>
+            </w:r>
+          </w:p>
+          <w:p>
+            <w:r>
+              <w:rPr>
+                <w:rFonts w:ascii="Malgun Gothic" w:hAnsi="Malgun Gothic" w:eastAsia="Malgun Gothic"/>
+                <w:sz w:val="20"/>
+              </w:rPr>
+            </w:r>
+          </w:p>
+          <w:p>
+            <w:r>
+              <w:rPr>
+                <w:rFonts w:ascii="Malgun Gothic" w:hAnsi="Malgun Gothic" w:eastAsia="Malgun Gothic"/>
+                <w:sz w:val="20"/>
+              </w:rPr>
+              <w:t>泰勒说他又无聊又软弱又一无所有，让他跪下，珍娜也在旁边帮腔，叫他这把老骨头也动一动。沃尔特忍无可忍，抡起拐杖朝泰勒脸上打去。泰勒嘴唇打裂，沃尔特冲他吼，靠女人养活也值得炫耀吗，布鲁克斯传媒养你这种人是耻辱，让他去把瓦妮莎·布鲁克斯叫来。</w:t>
+            </w:r>
+          </w:p>
+          <w:p>
+            <w:r>
+              <w:rPr>
+                <w:rFonts w:ascii="Malgun Gothic" w:hAnsi="Malgun Gothic" w:eastAsia="Malgun Gothic"/>
+                <w:sz w:val="20"/>
+              </w:rPr>
+              <w:t>"你……你说你是瓦妮莎的父亲？"</w:t>
             </w:r>
           </w:p>
           <w:p>
@@ -4930,33 +4930,33 @@
                 <w:rFonts w:ascii="Malgun Gothic" w:hAnsi="Malgun Gothic" w:eastAsia="Malgun Gothic"/>
                 <w:sz w:val="20"/>
               </w:rPr>
-              <w:t>泰勒知道瓦妮莎的父亲已经在国外住了五年,以为这两人在演戏。他一把夺过沃尔特的拐杖晃了晃,说拄这种破棍子也想装有钱人,说完就朝沃尔特腿上踹去。沃尔特倒地,伊森冲上去想扶,珍娜抡起铁锹砸在他肚子上。</w:t>
-            </w:r>
-          </w:p>
-          <w:p>
-            <w:r>
-              <w:rPr>
-                <w:rFonts w:ascii="Malgun Gothic" w:hAnsi="Malgun Gothic" w:eastAsia="Malgun Gothic"/>
-                <w:sz w:val="20"/>
-              </w:rPr>
-            </w:r>
-          </w:p>
-          <w:p>
-            <w:r>
-              <w:rPr>
-                <w:rFonts w:ascii="Malgun Gothic" w:hAnsi="Malgun Gothic" w:eastAsia="Malgun Gothic"/>
-                <w:sz w:val="20"/>
-              </w:rPr>
-              <w:t>趴在地上的伊森看见泰勒打开一个木箱,里面用干草包着一瓶1983年的罗曼尼·康帝。伊森喊那不是你的东西,泰勒说这俱乐部是我老婆的,这里的一切都是我的,说着连箱子带酒砸向伊森的后背。看着伊森栽倒在地,沃尔特大喊那个人是科尔集团的总裁,他手腕上那块表就值60万美元。泰勒脸上的笑容消失了。</w:t>
-            </w:r>
-          </w:p>
-          <w:p>
-            <w:r>
-              <w:rPr>
-                <w:rFonts w:ascii="Malgun Gothic" w:hAnsi="Malgun Gothic" w:eastAsia="Malgun Gothic"/>
-                <w:sz w:val="20"/>
-              </w:rPr>
-              <w:t>"新闻里那个科尔集团?"</w:t>
+              <w:t>泰勒知道瓦妮莎的父亲已经在国外住了五年，以为这两人在演戏。他一把夺过沃尔特的拐杖晃了晃，说拄这种破棍子也想装有钱人，说完就朝沃尔特腿上踹去。沃尔特倒地，伊森冲上去想扶，珍娜抡起铁锹砸在他肚子上。</w:t>
+            </w:r>
+          </w:p>
+          <w:p>
+            <w:r>
+              <w:rPr>
+                <w:rFonts w:ascii="Malgun Gothic" w:hAnsi="Malgun Gothic" w:eastAsia="Malgun Gothic"/>
+                <w:sz w:val="20"/>
+              </w:rPr>
+            </w:r>
+          </w:p>
+          <w:p>
+            <w:r>
+              <w:rPr>
+                <w:rFonts w:ascii="Malgun Gothic" w:hAnsi="Malgun Gothic" w:eastAsia="Malgun Gothic"/>
+                <w:sz w:val="20"/>
+              </w:rPr>
+              <w:t>趴在地上的伊森看见泰勒打开一个木箱，里面用干草包着一瓶1983年的罗曼尼·康帝。伊森喊那不是你的东西，泰勒说这俱乐部是我老婆的，这里的一切都是我的，说着连箱子带酒砸向伊森的后背。看着伊森栽倒在地，沃尔特大喊那个人是科尔集团的总裁，他手腕上那块表就值60万美元。泰勒脸上的笑容消失了。</w:t>
+            </w:r>
+          </w:p>
+          <w:p>
+            <w:r>
+              <w:rPr>
+                <w:rFonts w:ascii="Malgun Gothic" w:hAnsi="Malgun Gothic" w:eastAsia="Malgun Gothic"/>
+                <w:sz w:val="20"/>
+              </w:rPr>
+              <w:t>"新闻里那个科尔集团？"</w:t>
             </w:r>
           </w:p>
           <w:p>
@@ -4982,7 +4982,7 @@
                 <w:rFonts w:ascii="Malgun Gothic" w:hAnsi="Malgun Gothic" w:eastAsia="Malgun Gothic"/>
                 <w:sz w:val="20"/>
               </w:rPr>
-              <w:t>타일러는 곧 다시 웃으며, 콜 그룹 대표님이 한 번짜리 표를 끊고 여자 구경이나 하러 왔느냐고 묻는다. 화장을 고치던 제나가 저 한물간 놈이 회장이면 자기는 빅토리아 시크릿 모델이겠다고 거든다. 이선이 자기가 대표든 아니든 상관없으니 그 와인부터 내려놓으라고 하자, 타일러는 마부들을 시켜 이선을 무릎 꿇린다.</w:t>
+              <w:t>타일러는 곧 다시 웃으며, 콜 그룹 대표님이 마누라 돈으로 한 번짜리 표를 끊고 여자 구경이나 하러 왔느냐고 묻는다. 화장을 고치던 제나가 저 한물간 놈이 회장이면 자기는 빅토리아 시크릿 모델이겠다고 거든다. 이선이 자기가 대표든 아니든 상관없으니 그 와인부터 내려놓으라고 하자, 타일러는 마부들을 시켜 이선을 무릎 꿇린다.</w:t>
             </w:r>
           </w:p>
           <w:p>
@@ -5060,24 +5060,24 @@
                 <w:rFonts w:ascii="Malgun Gothic" w:hAnsi="Malgun Gothic" w:eastAsia="Malgun Gothic"/>
                 <w:sz w:val="20"/>
               </w:rPr>
-              <w:t>泰勒很快又笑了,问科尔集团总裁买张单次票是来看美女的吗。正在补妆的珍娜插话说,这种过气货要是董事长,她就是维多利亚的秘密的模特。伊森说管他是不是总裁,先把那瓶酒放下,泰勒示意马夫们把伊森按跪在地上。</w:t>
-            </w:r>
-          </w:p>
-          <w:p>
-            <w:r>
-              <w:rPr>
-                <w:rFonts w:ascii="Malgun Gothic" w:hAnsi="Malgun Gothic" w:eastAsia="Malgun Gothic"/>
-                <w:sz w:val="20"/>
-              </w:rPr>
-            </w:r>
-          </w:p>
-          <w:p>
-            <w:r>
-              <w:rPr>
-                <w:rFonts w:ascii="Malgun Gothic" w:hAnsi="Malgun Gothic" w:eastAsia="Malgun Gothic"/>
-                <w:sz w:val="20"/>
-              </w:rPr>
-              <w:t>泰勒拔开瓶塞,把酒往伊森头上倒。沃尔特想上前阻止,被珍娜一把推倒在地。伊森说那瓶酒是岳父送的礼物,对他来说意义重大,谁敢打碎绝不善罢甘休。泰勒说那就求我。</w:t>
+              <w:t>泰勒很快又笑了，问科尔集团总裁是拿老婆的钱买了张单次票来看美女的吗。正在补妆的珍娜插话说，这种过气货要是董事长，她就是维多利亚的秘密的模特。伊森说管他是不是总裁，先把那瓶酒放下，泰勒示意马夫们把伊森按跪在地上。</w:t>
+            </w:r>
+          </w:p>
+          <w:p>
+            <w:r>
+              <w:rPr>
+                <w:rFonts w:ascii="Malgun Gothic" w:hAnsi="Malgun Gothic" w:eastAsia="Malgun Gothic"/>
+                <w:sz w:val="20"/>
+              </w:rPr>
+            </w:r>
+          </w:p>
+          <w:p>
+            <w:r>
+              <w:rPr>
+                <w:rFonts w:ascii="Malgun Gothic" w:hAnsi="Malgun Gothic" w:eastAsia="Malgun Gothic"/>
+                <w:sz w:val="20"/>
+              </w:rPr>
+              <w:t>泰勒拔开瓶塞，把酒往伊森头上倒。沃尔特想上前阻止，被珍娜一把推倒在地。伊森说那瓶酒是岳父送的礼物，对他来说意义重大，谁敢打碎绝不善罢甘休。泰勒说那就求我。</w:t>
             </w:r>
           </w:p>
           <w:p>
@@ -5103,16 +5103,16 @@
                 <w:rFonts w:ascii="Malgun Gothic" w:hAnsi="Malgun Gothic" w:eastAsia="Malgun Gothic"/>
                 <w:sz w:val="20"/>
               </w:rPr>
-              <w:t>"男人最重要的是自尊。区区一瓶酒,不值得你为它下跪。"</w:t>
-            </w:r>
-          </w:p>
-          <w:p>
-            <w:r>
-              <w:rPr>
-                <w:rFonts w:ascii="Malgun Gothic" w:hAnsi="Malgun Gothic" w:eastAsia="Malgun Gothic"/>
-                <w:sz w:val="20"/>
-              </w:rPr>
-              <w:t>沃尔特说这酒是我送你的,现在是你的东西,碎不碎都不会改变我对你的心意。泰勒说少来这套父子情深的戏码,把剩下的酒全泼在两人头上。沃尔特喊那瓶酒值70万美元,比你这条命还贵,泰勒把酒瓶摔在地上,酒瓶四分五裂。</w:t>
+              <w:t>"男人最重要的是自尊。区区一瓶酒，不值得你为它下跪。"</w:t>
+            </w:r>
+          </w:p>
+          <w:p>
+            <w:r>
+              <w:rPr>
+                <w:rFonts w:ascii="Malgun Gothic" w:hAnsi="Malgun Gothic" w:eastAsia="Malgun Gothic"/>
+                <w:sz w:val="20"/>
+              </w:rPr>
+              <w:t>沃尔特说这酒是我送你的，现在是你的东西，碎不碎都不会改变我对你的心意。泰勒说少来这套父子情深的戏码，把剩下的酒全泼在两人头上。沃尔特喊那瓶酒值70万美元，比你这条命还贵，泰勒把酒瓶摔在地上，酒瓶四分五裂。</w:t>
             </w:r>
           </w:p>
           <w:p>
@@ -5207,50 +5207,50 @@
                 <w:rFonts w:ascii="Malgun Gothic" w:hAnsi="Malgun Gothic" w:eastAsia="Malgun Gothic"/>
                 <w:sz w:val="20"/>
               </w:rPr>
-              <w:t>伊森伸手去捡地上的碎玻璃,泰勒一脚踩住他的手。玻璃扎进掌心,伊森还是说,傍上一个有钱女人就这么嚣张,等她来了看你还护不护着你。泰勒掏出手机给老婆打视频电话。</w:t>
-            </w:r>
-          </w:p>
-          <w:p>
-            <w:r>
-              <w:rPr>
-                <w:rFonts w:ascii="Malgun Gothic" w:hAnsi="Malgun Gothic" w:eastAsia="Malgun Gothic"/>
-                <w:sz w:val="20"/>
-              </w:rPr>
-            </w:r>
-          </w:p>
-          <w:p>
-            <w:r>
-              <w:rPr>
-                <w:rFonts w:ascii="Malgun Gothic" w:hAnsi="Malgun Gothic" w:eastAsia="Malgun Gothic"/>
-                <w:sz w:val="20"/>
-              </w:rPr>
-              <w:t>这时瓦妮莎正和朋友们坐在茶室里,炫耀说只要跟斯特林集团新任董事长诺拉·斯特林签下合同,自己身价就不一样了。瓦妮莎不知道丈夫早就把那份合同拿到手了。看到脸上带伤的泰勒出现在屏幕上,瓦妮莎骂是哪个疯子敢碰她的男人,让马夫们好好教训一顿。镜头背后正是被马夫们按住的伊森。</w:t>
-            </w:r>
-          </w:p>
-          <w:p>
-            <w:r>
-              <w:rPr>
-                <w:rFonts w:ascii="Malgun Gothic" w:hAnsi="Malgun Gothic" w:eastAsia="Malgun Gothic"/>
-                <w:sz w:val="20"/>
-              </w:rPr>
-            </w:r>
-          </w:p>
-          <w:p>
-            <w:r>
-              <w:rPr>
-                <w:rFonts w:ascii="Malgun Gothic" w:hAnsi="Malgun Gothic" w:eastAsia="Malgun Gothic"/>
-                <w:sz w:val="20"/>
-              </w:rPr>
-              <w:t>瓦妮莎撂下一句今晚好好伺候我,挂了电话。泰勒问伊森听见了吗,我老婆一句话,你们就在这一行别想再混下去。浑身是血和酒渍的伊森推开马夫的手,掏出电话,拨通了发小诺拉·斯特林的号码。</w:t>
-            </w:r>
-          </w:p>
-          <w:p>
-            <w:r>
-              <w:rPr>
-                <w:rFonts w:ascii="Malgun Gothic" w:hAnsi="Malgun Gothic" w:eastAsia="Malgun Gothic"/>
-                <w:sz w:val="20"/>
-              </w:rPr>
-              <w:t>"诺拉,给我找最好的离婚律师,现在,马上。"</w:t>
+              <w:t>伊森伸手去捡地上的碎玻璃，泰勒一脚踩住他的手。玻璃扎进掌心，伊森还是说，傍上一个有钱女人就这么嚣张，等她来了看你还护不护着你。泰勒掏出手机给老婆打视频电话。</w:t>
+            </w:r>
+          </w:p>
+          <w:p>
+            <w:r>
+              <w:rPr>
+                <w:rFonts w:ascii="Malgun Gothic" w:hAnsi="Malgun Gothic" w:eastAsia="Malgun Gothic"/>
+                <w:sz w:val="20"/>
+              </w:rPr>
+            </w:r>
+          </w:p>
+          <w:p>
+            <w:r>
+              <w:rPr>
+                <w:rFonts w:ascii="Malgun Gothic" w:hAnsi="Malgun Gothic" w:eastAsia="Malgun Gothic"/>
+                <w:sz w:val="20"/>
+              </w:rPr>
+              <w:t>这时瓦妮莎正和朋友们坐在茶室里，炫耀说只要跟斯特林集团新任董事长诺拉·斯特林签下合同，自己身价就不一样了。瓦妮莎不知道丈夫早就把那份合同拿到手了。看到脸上带伤的泰勒出现在屏幕上，瓦妮莎骂是哪个疯子敢碰她的男人，让马夫们好好教训一顿。镜头背后正是被马夫们按住的伊森。</w:t>
+            </w:r>
+          </w:p>
+          <w:p>
+            <w:r>
+              <w:rPr>
+                <w:rFonts w:ascii="Malgun Gothic" w:hAnsi="Malgun Gothic" w:eastAsia="Malgun Gothic"/>
+                <w:sz w:val="20"/>
+              </w:rPr>
+            </w:r>
+          </w:p>
+          <w:p>
+            <w:r>
+              <w:rPr>
+                <w:rFonts w:ascii="Malgun Gothic" w:hAnsi="Malgun Gothic" w:eastAsia="Malgun Gothic"/>
+                <w:sz w:val="20"/>
+              </w:rPr>
+              <w:t>瓦妮莎撂下一句今晚好好伺候我，挂了电话。泰勒问伊森听见了吗，我老婆一句话，你们就在这一行别想再混下去。浑身是血和酒渍的伊森推开马夫的手，掏出电话，拨通了发小诺拉·斯特林的号码。</w:t>
+            </w:r>
+          </w:p>
+          <w:p>
+            <w:r>
+              <w:rPr>
+                <w:rFonts w:ascii="Malgun Gothic" w:hAnsi="Malgun Gothic" w:eastAsia="Malgun Gothic"/>
+                <w:sz w:val="20"/>
+              </w:rPr>
+              <w:t>"诺拉，给我找最好的离婚律师，现在，马上。"</w:t>
             </w:r>
           </w:p>
           <w:p>
@@ -5276,7 +5276,7 @@
                 <w:rFonts w:ascii="Malgun Gothic" w:hAnsi="Malgun Gothic" w:eastAsia="Malgun Gothic"/>
                 <w:sz w:val="20"/>
               </w:rPr>
-              <w:t>전화를 받은 노라는 재킷을 집어 들며 혼자 두지 않겠다고 말하고, 카페에서 기다리는 바네사와의 광고 미팅을 취소하라고 지시한다. 클럽에서는 제나가 네 아내가 오히려 이혼해 달라고 빌 거라며 웃는다. 월터가 돈 때문에 몸이나 파는 놈이라고 소리치자, 타일러가 월터의 멱살을 잡아 벽으로 밀어붙인다.</w:t>
+              <w:t>전화를 받은 노라는 재킷을 집어 들며 혼자 두지 않겠다고 말하고, 카페에서 기다리는 바네사와의 광고 미팅을 취소하라고 지시한다. 클럽에서는 제나가 네 아내가 오히려 이혼해 달라고 빌 거라며 웃는다. 월터가 돈 때문에 몸 파는 놈이라고 소리치자, 타일러가 네 사위 얘기냐며 월터의 멱살을 잡아 벽으로 밀어붙인다.</w:t>
             </w:r>
           </w:p>
           <w:p>
@@ -5363,68 +5363,68 @@
                 <w:rFonts w:ascii="Malgun Gothic" w:hAnsi="Malgun Gothic" w:eastAsia="Malgun Gothic"/>
                 <w:sz w:val="20"/>
               </w:rPr>
-              <w:t>接到电话的诺拉抓起外套,说不会让他一个人扛,让人取消跟瓦妮莎在咖啡馆的广告会面。俱乐部里,珍娜笑着说你老婆到时候只会求着离婚。沃尔特骂他是靠卖身换钱的东西,泰勒一把揪住沃尔特的衣领,把他按在墙上。</w:t>
-            </w:r>
-          </w:p>
-          <w:p>
-            <w:r>
-              <w:rPr>
-                <w:rFonts w:ascii="Malgun Gothic" w:hAnsi="Malgun Gothic" w:eastAsia="Malgun Gothic"/>
-                <w:sz w:val="20"/>
-              </w:rPr>
-            </w:r>
-          </w:p>
-          <w:p>
-            <w:r>
-              <w:rPr>
-                <w:rFonts w:ascii="Malgun Gothic" w:hAnsi="Malgun Gothic" w:eastAsia="Malgun Gothic"/>
-                <w:sz w:val="20"/>
-              </w:rPr>
-              <w:t>倒在地上的伊森捡起马鞍站起来,朝泰勒背上砸去。泰勒惨叫一声倒地,松开了沃尔特。伊森骑到他身上,把他的头往地上按。珍娜一脚踩住倒地的沃尔特的胸口,警告他再动一下下一个就是你。马夫们把伊森拉开。</w:t>
-            </w:r>
-          </w:p>
-          <w:p>
-            <w:r>
-              <w:rPr>
-                <w:rFonts w:ascii="Malgun Gothic" w:hAnsi="Malgun Gothic" w:eastAsia="Malgun Gothic"/>
-                <w:sz w:val="20"/>
-              </w:rPr>
-            </w:r>
-          </w:p>
-          <w:p>
-            <w:r>
-              <w:rPr>
-                <w:rFonts w:ascii="Malgun Gothic" w:hAnsi="Malgun Gothic" w:eastAsia="Malgun Gothic"/>
-                <w:sz w:val="20"/>
-              </w:rPr>
-              <w:t>泰勒抹掉脸上的血,下令把伊森按趴在地上。</w:t>
-            </w:r>
-          </w:p>
-          <w:p>
-            <w:r>
-              <w:rPr>
-                <w:rFonts w:ascii="Malgun Gothic" w:hAnsi="Malgun Gothic" w:eastAsia="Malgun Gothic"/>
-                <w:sz w:val="20"/>
-              </w:rPr>
-              <w:t>"给我像狗一样爬过来,让大家看看。"</w:t>
-            </w:r>
-          </w:p>
-          <w:p>
-            <w:r>
-              <w:rPr>
-                <w:rFonts w:ascii="Malgun Gothic" w:hAnsi="Malgun Gothic" w:eastAsia="Malgun Gothic"/>
-                <w:sz w:val="20"/>
-              </w:rPr>
-              <w:t>伊森甩开马夫扑上去,戴着戒指的拳头砸在泰勒胸口。伊森再次被按住,马夫们把他推进马厩,推到一匹暴躁的种马面前。泰勒抡起饲料桶砸向想拦他的沃尔特的腰,锁上了马厩的门。</w:t>
-            </w:r>
-          </w:p>
-          <w:p>
-            <w:r>
-              <w:rPr>
-                <w:rFonts w:ascii="Malgun Gothic" w:hAnsi="Malgun Gothic" w:eastAsia="Malgun Gothic"/>
-                <w:sz w:val="20"/>
-              </w:rPr>
-              <w:t>"你被关在这儿的时候,你老婆正骑在别的男人身上呢。"</w:t>
+              <w:t>接到电话的诺拉抓起外套，说不会让他一个人扛，让人取消跟瓦妮莎在咖啡馆的广告会面。俱乐部里，珍娜笑着说你老婆到时候只会求着离婚。沃尔特骂他是靠卖身换钱的东西，泰勒反问是在说你女婿吧，一把揪住沃尔特的衣领按在墙上。</w:t>
+            </w:r>
+          </w:p>
+          <w:p>
+            <w:r>
+              <w:rPr>
+                <w:rFonts w:ascii="Malgun Gothic" w:hAnsi="Malgun Gothic" w:eastAsia="Malgun Gothic"/>
+                <w:sz w:val="20"/>
+              </w:rPr>
+            </w:r>
+          </w:p>
+          <w:p>
+            <w:r>
+              <w:rPr>
+                <w:rFonts w:ascii="Malgun Gothic" w:hAnsi="Malgun Gothic" w:eastAsia="Malgun Gothic"/>
+                <w:sz w:val="20"/>
+              </w:rPr>
+              <w:t>倒在地上的伊森捡起马鞍站起来，朝泰勒背上砸去。泰勒惨叫一声倒地，松开了沃尔特。伊森骑到他身上，把他的头往地上按。珍娜一脚踩住倒地的沃尔特的胸口，警告他再动一下下一个就是你。马夫们把伊森拉开。</w:t>
+            </w:r>
+          </w:p>
+          <w:p>
+            <w:r>
+              <w:rPr>
+                <w:rFonts w:ascii="Malgun Gothic" w:hAnsi="Malgun Gothic" w:eastAsia="Malgun Gothic"/>
+                <w:sz w:val="20"/>
+              </w:rPr>
+            </w:r>
+          </w:p>
+          <w:p>
+            <w:r>
+              <w:rPr>
+                <w:rFonts w:ascii="Malgun Gothic" w:hAnsi="Malgun Gothic" w:eastAsia="Malgun Gothic"/>
+                <w:sz w:val="20"/>
+              </w:rPr>
+              <w:t>泰勒抹掉脸上的血，下令把伊森按趴在地上。</w:t>
+            </w:r>
+          </w:p>
+          <w:p>
+            <w:r>
+              <w:rPr>
+                <w:rFonts w:ascii="Malgun Gothic" w:hAnsi="Malgun Gothic" w:eastAsia="Malgun Gothic"/>
+                <w:sz w:val="20"/>
+              </w:rPr>
+              <w:t>"给我像狗一样爬过来，让大家看看。"</w:t>
+            </w:r>
+          </w:p>
+          <w:p>
+            <w:r>
+              <w:rPr>
+                <w:rFonts w:ascii="Malgun Gothic" w:hAnsi="Malgun Gothic" w:eastAsia="Malgun Gothic"/>
+                <w:sz w:val="20"/>
+              </w:rPr>
+              <w:t>伊森甩开马夫扑上去，戴着戒指的拳头砸在泰勒胸口。伊森再次被按住，马夫们把他推进马厩，推到一匹暴躁的种马面前。泰勒抡起饲料桶砸向想拦他的沃尔特的腰，锁上了马厩的门。</w:t>
+            </w:r>
+          </w:p>
+          <w:p>
+            <w:r>
+              <w:rPr>
+                <w:rFonts w:ascii="Malgun Gothic" w:hAnsi="Malgun Gothic" w:eastAsia="Malgun Gothic"/>
+                <w:sz w:val="20"/>
+              </w:rPr>
+              <w:t>"你被关在这儿的时候，你老婆正骑在别的男人身上呢。"</w:t>
             </w:r>
           </w:p>
           <w:p>
@@ -5484,7 +5484,7 @@
                 <w:rFonts w:ascii="Malgun Gothic" w:hAnsi="Malgun Gothic" w:eastAsia="Malgun Gothic"/>
                 <w:sz w:val="20"/>
               </w:rPr>
-              <w:t>타일러가 전화를 세워 놓고, 늙은이 둘이 사기를 치려다 걸렸다며 이제 저 사람이 기는 걸 보게 될 거라고 웃는다. 그 손목의 시계가 한정판 파텍 필립 아니냐는 댓글이 올라오자, 타일러는 시계를 빼내 짝퉁이고 기껏해야 600달러라며 바닥에 내던져 박살 낸다. 그런데 댓글이 멈추지 않는다. 60만 달러짜리 그 시계를 영화제에서 봤다는 말과 바네사의 남편이 콜 그룹 대표라는 말이 화면을 채운다. 화면을 읽던 제나가 입을 다물고, 타일러가 말을 더듬는다.</w:t>
+              <w:t>타일러가 전화를 세워 놓고, 늙은이 둘이 사기를 치려다 걸렸다며 이제 저 사람이 기는 걸 보게 될 거라고 웃는다. 그 손목의 시계가 한정판 파텍 필립 아니냐는 댓글이 올라오자, 타일러는 시계를 빼내 짝퉁이고 기껏해야 600달러라며 바닥에 내던져 박살 낸다. 그런데 댓글이 멈추지 않는다. 그 시계가 60만 달러라는 말, 바네사가 영화제에 데려왔던 남편이 콜 그룹 대표이고 바네사는 그 돈으로 컸다는 말이 화면을 채운다. 화면을 읽던 제나가 입을 다물고, 타일러가 말을 더듬는다.</w:t>
             </w:r>
           </w:p>
           <w:p>
@@ -5519,50 +5519,50 @@
                 <w:rFonts w:ascii="Malgun Gothic" w:hAnsi="Malgun Gothic" w:eastAsia="Malgun Gothic"/>
                 <w:sz w:val="20"/>
               </w:rPr>
-              <w:t>种马直立起来扬起前蹄,伊森徒手抓住缰绳把它拽下来。马夫们在门外大喊,故意让马更加暴躁,伊森的手却始终没松开,泰勒脸上的笑容消失了。就在这时,俱乐部经理迪恩推门冲进来,按住马,把伊森拉了出去。</w:t>
-            </w:r>
-          </w:p>
-          <w:p>
-            <w:r>
-              <w:rPr>
-                <w:rFonts w:ascii="Malgun Gothic" w:hAnsi="Malgun Gothic" w:eastAsia="Malgun Gothic"/>
-                <w:sz w:val="20"/>
-              </w:rPr>
-            </w:r>
-          </w:p>
-          <w:p>
-            <w:r>
-              <w:rPr>
-                <w:rFonts w:ascii="Malgun Gothic" w:hAnsi="Malgun Gothic" w:eastAsia="Malgun Gothic"/>
-                <w:sz w:val="20"/>
-              </w:rPr>
-              <w:t>泰勒撒谎说是这两个穷光蛋来找茬。沃尔特站起来大喊自己是瓦妮莎的父亲,伊森也再次说明自己是科尔集团总裁、瓦妮莎的丈夫。迪恩说没见过这两个人。珍娜说哪有总裁连年费都不交的,让哥哥开直播。</w:t>
-            </w:r>
-          </w:p>
-          <w:p>
-            <w:r>
-              <w:rPr>
-                <w:rFonts w:ascii="Malgun Gothic" w:hAnsi="Malgun Gothic" w:eastAsia="Malgun Gothic"/>
-                <w:sz w:val="20"/>
-              </w:rPr>
-            </w:r>
-          </w:p>
-          <w:p>
-            <w:r>
-              <w:rPr>
-                <w:rFonts w:ascii="Malgun Gothic" w:hAnsi="Malgun Gothic" w:eastAsia="Malgun Gothic"/>
-                <w:sz w:val="20"/>
-              </w:rPr>
-              <w:t>泰勒把手机架起来,笑着说两个老家伙想骗人被当场抓了,现在大家就要看他跪地求饶。这时评论区有人问他手腕上那块表是不是限量版百达翡丽,泰勒摘下手表说是仿的,顶多值600美元,说着摔在地上砸得粉碎。可评论却没停下来。有人说在电影节上见过那块价值60万美元的表,还有人说瓦妮莎的丈夫就是科尔集团的总裁,评论刷满了屏幕。正在念评论的珍娜说不出话来,泰勒结结巴巴。</w:t>
-            </w:r>
-          </w:p>
-          <w:p>
-            <w:r>
-              <w:rPr>
-                <w:rFonts w:ascii="Malgun Gothic" w:hAnsi="Malgun Gothic" w:eastAsia="Malgun Gothic"/>
-                <w:sz w:val="20"/>
-              </w:rPr>
-              <w:t>"你……你真的是瓦妮莎的丈夫?"</w:t>
+              <w:t>种马直立起来扬起前蹄，伊森徒手抓住缰绳把它拽下来。马夫们在门外大喊，故意让马更加暴躁，伊森的手却始终没松开，泰勒脸上的笑容消失了。就在这时，俱乐部经理迪恩推门冲进来，按住马，把伊森拉了出去。</w:t>
+            </w:r>
+          </w:p>
+          <w:p>
+            <w:r>
+              <w:rPr>
+                <w:rFonts w:ascii="Malgun Gothic" w:hAnsi="Malgun Gothic" w:eastAsia="Malgun Gothic"/>
+                <w:sz w:val="20"/>
+              </w:rPr>
+            </w:r>
+          </w:p>
+          <w:p>
+            <w:r>
+              <w:rPr>
+                <w:rFonts w:ascii="Malgun Gothic" w:hAnsi="Malgun Gothic" w:eastAsia="Malgun Gothic"/>
+                <w:sz w:val="20"/>
+              </w:rPr>
+              <w:t>泰勒撒谎说是这两个穷光蛋来找茬。沃尔特站起来大喊自己是瓦妮莎的父亲，伊森也再次说明自己是科尔集团总裁、瓦妮莎的丈夫。迪恩说没见过这两个人。珍娜说哪有总裁连年费都不交的，让哥哥开直播。</w:t>
+            </w:r>
+          </w:p>
+          <w:p>
+            <w:r>
+              <w:rPr>
+                <w:rFonts w:ascii="Malgun Gothic" w:hAnsi="Malgun Gothic" w:eastAsia="Malgun Gothic"/>
+                <w:sz w:val="20"/>
+              </w:rPr>
+            </w:r>
+          </w:p>
+          <w:p>
+            <w:r>
+              <w:rPr>
+                <w:rFonts w:ascii="Malgun Gothic" w:hAnsi="Malgun Gothic" w:eastAsia="Malgun Gothic"/>
+                <w:sz w:val="20"/>
+              </w:rPr>
+              <w:t>泰勒把手机架起来，笑着说两个老家伙想骗人被当场抓了，现在大家就要看他跪地求饶。这时评论区有人问他手腕上那块表是不是限量版百达翡丽，泰勒摘下手表说是仿的，顶多值600美元，说着摔在地上砸得粉碎。可评论却没停下来。有人说那块表值60万美元，有人说瓦妮莎带去电影节的那个丈夫就是科尔集团的总裁、瓦妮莎是靠他的钱起来的，评论刷满了屏幕。正在念评论的珍娜说不出话来，泰勒结结巴巴。</w:t>
+            </w:r>
+          </w:p>
+          <w:p>
+            <w:r>
+              <w:rPr>
+                <w:rFonts w:ascii="Malgun Gothic" w:hAnsi="Malgun Gothic" w:eastAsia="Malgun Gothic"/>
+                <w:sz w:val="20"/>
+              </w:rPr>
+              <w:t>"你……你真的是瓦妮莎的丈夫？"</w:t>
             </w:r>
           </w:p>
         </w:tc>

</xml_diff>